<commit_message>
chore(release): snapshot sanitized desktop 0.2.1-rc.5 source
Corresponds to original source d01947b1e39dd03d76fc301829b842a6ff197121.
Public-only ancestry; declared sanitization and public-file preservation.

Assisted-by: OpenAI Codex
Co-Authored-By: OpenAI Codex <noreply@openai.com>
</commit_message>
<xml_diff>
--- a/branding/example/nodejs/public/elixir/brand/templates/ar/assessment-grid.docx
+++ b/branding/example/nodejs/public/elixir/brand/templates/ar/assessment-grid.docx
@@ -271,8 +271,8 @@
       </w:pPr>
       <w:r>
         <w:rPr>
-          <w:i/>
-          <w:iCs/>
+          <w:i w:val="0"/>
+          <w:iCs w:val="0"/>
           <w:color w:val="595959"/>
           <w:sz w:val="18"/>
           <w:szCs w:val="18"/>
@@ -572,9 +572,13 @@
                 <w:sz w:val="28"/>
                 <w:szCs w:val="28"/>
                 <w:rFonts w:ascii="DejaVu Sans" w:hAnsi="DejaVu Sans" w:eastAsia="DejaVu Sans" w:cs="DejaVu Sans"/>
+                <w:b w:val="0"/>
+                <w:bCs w:val="0"/>
+                <w:i w:val="0"/>
+                <w:iCs w:val="0"/>
                 <w:rtl w:val="0"/>
               </w:rPr>
-              <w:sym w:font="DejaVu Sans" w:char="F0A8"/>
+              <w:t>☐</w:t>
             </w:r>
           </w:p>
         </w:tc>
@@ -594,9 +598,13 @@
                 <w:sz w:val="28"/>
                 <w:szCs w:val="28"/>
                 <w:rFonts w:ascii="DejaVu Sans" w:hAnsi="DejaVu Sans" w:eastAsia="DejaVu Sans" w:cs="DejaVu Sans"/>
+                <w:b w:val="0"/>
+                <w:bCs w:val="0"/>
+                <w:i w:val="0"/>
+                <w:iCs w:val="0"/>
                 <w:rtl w:val="0"/>
               </w:rPr>
-              <w:sym w:font="DejaVu Sans" w:char="F0A8"/>
+              <w:t>☐</w:t>
             </w:r>
           </w:p>
         </w:tc>
@@ -616,9 +624,13 @@
                 <w:sz w:val="28"/>
                 <w:szCs w:val="28"/>
                 <w:rFonts w:ascii="DejaVu Sans" w:hAnsi="DejaVu Sans" w:eastAsia="DejaVu Sans" w:cs="DejaVu Sans"/>
+                <w:b w:val="0"/>
+                <w:bCs w:val="0"/>
+                <w:i w:val="0"/>
+                <w:iCs w:val="0"/>
                 <w:rtl w:val="0"/>
               </w:rPr>
-              <w:sym w:font="DejaVu Sans" w:char="F0A8"/>
+              <w:t>☐</w:t>
             </w:r>
           </w:p>
         </w:tc>
@@ -638,9 +650,13 @@
                 <w:sz w:val="28"/>
                 <w:szCs w:val="28"/>
                 <w:rFonts w:ascii="DejaVu Sans" w:hAnsi="DejaVu Sans" w:eastAsia="DejaVu Sans" w:cs="DejaVu Sans"/>
+                <w:b w:val="0"/>
+                <w:bCs w:val="0"/>
+                <w:i w:val="0"/>
+                <w:iCs w:val="0"/>
                 <w:rtl w:val="0"/>
               </w:rPr>
-              <w:sym w:font="DejaVu Sans" w:char="F0A8"/>
+              <w:t>☐</w:t>
             </w:r>
           </w:p>
         </w:tc>
@@ -731,9 +747,13 @@
                 <w:sz w:val="28"/>
                 <w:szCs w:val="28"/>
                 <w:rFonts w:ascii="DejaVu Sans" w:hAnsi="DejaVu Sans" w:eastAsia="DejaVu Sans" w:cs="DejaVu Sans"/>
+                <w:b w:val="0"/>
+                <w:bCs w:val="0"/>
+                <w:i w:val="0"/>
+                <w:iCs w:val="0"/>
                 <w:rtl w:val="0"/>
               </w:rPr>
-              <w:sym w:font="DejaVu Sans" w:char="F0A8"/>
+              <w:t>☐</w:t>
             </w:r>
           </w:p>
         </w:tc>
@@ -753,9 +773,13 @@
                 <w:sz w:val="28"/>
                 <w:szCs w:val="28"/>
                 <w:rFonts w:ascii="DejaVu Sans" w:hAnsi="DejaVu Sans" w:eastAsia="DejaVu Sans" w:cs="DejaVu Sans"/>
+                <w:b w:val="0"/>
+                <w:bCs w:val="0"/>
+                <w:i w:val="0"/>
+                <w:iCs w:val="0"/>
                 <w:rtl w:val="0"/>
               </w:rPr>
-              <w:sym w:font="DejaVu Sans" w:char="F0A8"/>
+              <w:t>☐</w:t>
             </w:r>
           </w:p>
         </w:tc>
@@ -775,9 +799,13 @@
                 <w:sz w:val="28"/>
                 <w:szCs w:val="28"/>
                 <w:rFonts w:ascii="DejaVu Sans" w:hAnsi="DejaVu Sans" w:eastAsia="DejaVu Sans" w:cs="DejaVu Sans"/>
+                <w:b w:val="0"/>
+                <w:bCs w:val="0"/>
+                <w:i w:val="0"/>
+                <w:iCs w:val="0"/>
                 <w:rtl w:val="0"/>
               </w:rPr>
-              <w:sym w:font="DejaVu Sans" w:char="F0A8"/>
+              <w:t>☐</w:t>
             </w:r>
           </w:p>
         </w:tc>
@@ -797,9 +825,13 @@
                 <w:sz w:val="28"/>
                 <w:szCs w:val="28"/>
                 <w:rFonts w:ascii="DejaVu Sans" w:hAnsi="DejaVu Sans" w:eastAsia="DejaVu Sans" w:cs="DejaVu Sans"/>
+                <w:b w:val="0"/>
+                <w:bCs w:val="0"/>
+                <w:i w:val="0"/>
+                <w:iCs w:val="0"/>
                 <w:rtl w:val="0"/>
               </w:rPr>
-              <w:sym w:font="DejaVu Sans" w:char="F0A8"/>
+              <w:t>☐</w:t>
             </w:r>
           </w:p>
         </w:tc>
@@ -890,9 +922,13 @@
                 <w:sz w:val="28"/>
                 <w:szCs w:val="28"/>
                 <w:rFonts w:ascii="DejaVu Sans" w:hAnsi="DejaVu Sans" w:eastAsia="DejaVu Sans" w:cs="DejaVu Sans"/>
+                <w:b w:val="0"/>
+                <w:bCs w:val="0"/>
+                <w:i w:val="0"/>
+                <w:iCs w:val="0"/>
                 <w:rtl w:val="0"/>
               </w:rPr>
-              <w:sym w:font="DejaVu Sans" w:char="F0A8"/>
+              <w:t>☐</w:t>
             </w:r>
           </w:p>
         </w:tc>
@@ -912,9 +948,13 @@
                 <w:sz w:val="28"/>
                 <w:szCs w:val="28"/>
                 <w:rFonts w:ascii="DejaVu Sans" w:hAnsi="DejaVu Sans" w:eastAsia="DejaVu Sans" w:cs="DejaVu Sans"/>
+                <w:b w:val="0"/>
+                <w:bCs w:val="0"/>
+                <w:i w:val="0"/>
+                <w:iCs w:val="0"/>
                 <w:rtl w:val="0"/>
               </w:rPr>
-              <w:sym w:font="DejaVu Sans" w:char="F0A8"/>
+              <w:t>☐</w:t>
             </w:r>
           </w:p>
         </w:tc>
@@ -934,9 +974,13 @@
                 <w:sz w:val="28"/>
                 <w:szCs w:val="28"/>
                 <w:rFonts w:ascii="DejaVu Sans" w:hAnsi="DejaVu Sans" w:eastAsia="DejaVu Sans" w:cs="DejaVu Sans"/>
+                <w:b w:val="0"/>
+                <w:bCs w:val="0"/>
+                <w:i w:val="0"/>
+                <w:iCs w:val="0"/>
                 <w:rtl w:val="0"/>
               </w:rPr>
-              <w:sym w:font="DejaVu Sans" w:char="F0A8"/>
+              <w:t>☐</w:t>
             </w:r>
           </w:p>
         </w:tc>
@@ -956,9 +1000,13 @@
                 <w:sz w:val="28"/>
                 <w:szCs w:val="28"/>
                 <w:rFonts w:ascii="DejaVu Sans" w:hAnsi="DejaVu Sans" w:eastAsia="DejaVu Sans" w:cs="DejaVu Sans"/>
+                <w:b w:val="0"/>
+                <w:bCs w:val="0"/>
+                <w:i w:val="0"/>
+                <w:iCs w:val="0"/>
                 <w:rtl w:val="0"/>
               </w:rPr>
-              <w:sym w:font="DejaVu Sans" w:char="F0A8"/>
+              <w:t>☐</w:t>
             </w:r>
           </w:p>
         </w:tc>
@@ -1049,9 +1097,13 @@
                 <w:sz w:val="28"/>
                 <w:szCs w:val="28"/>
                 <w:rFonts w:ascii="DejaVu Sans" w:hAnsi="DejaVu Sans" w:eastAsia="DejaVu Sans" w:cs="DejaVu Sans"/>
+                <w:b w:val="0"/>
+                <w:bCs w:val="0"/>
+                <w:i w:val="0"/>
+                <w:iCs w:val="0"/>
                 <w:rtl w:val="0"/>
               </w:rPr>
-              <w:sym w:font="DejaVu Sans" w:char="F0A8"/>
+              <w:t>☐</w:t>
             </w:r>
           </w:p>
         </w:tc>
@@ -1071,9 +1123,13 @@
                 <w:sz w:val="28"/>
                 <w:szCs w:val="28"/>
                 <w:rFonts w:ascii="DejaVu Sans" w:hAnsi="DejaVu Sans" w:eastAsia="DejaVu Sans" w:cs="DejaVu Sans"/>
+                <w:b w:val="0"/>
+                <w:bCs w:val="0"/>
+                <w:i w:val="0"/>
+                <w:iCs w:val="0"/>
                 <w:rtl w:val="0"/>
               </w:rPr>
-              <w:sym w:font="DejaVu Sans" w:char="F0A8"/>
+              <w:t>☐</w:t>
             </w:r>
           </w:p>
         </w:tc>
@@ -1093,9 +1149,13 @@
                 <w:sz w:val="28"/>
                 <w:szCs w:val="28"/>
                 <w:rFonts w:ascii="DejaVu Sans" w:hAnsi="DejaVu Sans" w:eastAsia="DejaVu Sans" w:cs="DejaVu Sans"/>
+                <w:b w:val="0"/>
+                <w:bCs w:val="0"/>
+                <w:i w:val="0"/>
+                <w:iCs w:val="0"/>
                 <w:rtl w:val="0"/>
               </w:rPr>
-              <w:sym w:font="DejaVu Sans" w:char="F0A8"/>
+              <w:t>☐</w:t>
             </w:r>
           </w:p>
         </w:tc>
@@ -1115,9 +1175,13 @@
                 <w:sz w:val="28"/>
                 <w:szCs w:val="28"/>
                 <w:rFonts w:ascii="DejaVu Sans" w:hAnsi="DejaVu Sans" w:eastAsia="DejaVu Sans" w:cs="DejaVu Sans"/>
+                <w:b w:val="0"/>
+                <w:bCs w:val="0"/>
+                <w:i w:val="0"/>
+                <w:iCs w:val="0"/>
                 <w:rtl w:val="0"/>
               </w:rPr>
-              <w:sym w:font="DejaVu Sans" w:char="F0A8"/>
+              <w:t>☐</w:t>
             </w:r>
           </w:p>
         </w:tc>
@@ -1208,9 +1272,13 @@
                 <w:sz w:val="28"/>
                 <w:szCs w:val="28"/>
                 <w:rFonts w:ascii="DejaVu Sans" w:hAnsi="DejaVu Sans" w:eastAsia="DejaVu Sans" w:cs="DejaVu Sans"/>
+                <w:b w:val="0"/>
+                <w:bCs w:val="0"/>
+                <w:i w:val="0"/>
+                <w:iCs w:val="0"/>
                 <w:rtl w:val="0"/>
               </w:rPr>
-              <w:sym w:font="DejaVu Sans" w:char="F0A8"/>
+              <w:t>☐</w:t>
             </w:r>
           </w:p>
         </w:tc>
@@ -1230,9 +1298,13 @@
                 <w:sz w:val="28"/>
                 <w:szCs w:val="28"/>
                 <w:rFonts w:ascii="DejaVu Sans" w:hAnsi="DejaVu Sans" w:eastAsia="DejaVu Sans" w:cs="DejaVu Sans"/>
+                <w:b w:val="0"/>
+                <w:bCs w:val="0"/>
+                <w:i w:val="0"/>
+                <w:iCs w:val="0"/>
                 <w:rtl w:val="0"/>
               </w:rPr>
-              <w:sym w:font="DejaVu Sans" w:char="F0A8"/>
+              <w:t>☐</w:t>
             </w:r>
           </w:p>
         </w:tc>
@@ -1252,9 +1324,13 @@
                 <w:sz w:val="28"/>
                 <w:szCs w:val="28"/>
                 <w:rFonts w:ascii="DejaVu Sans" w:hAnsi="DejaVu Sans" w:eastAsia="DejaVu Sans" w:cs="DejaVu Sans"/>
+                <w:b w:val="0"/>
+                <w:bCs w:val="0"/>
+                <w:i w:val="0"/>
+                <w:iCs w:val="0"/>
                 <w:rtl w:val="0"/>
               </w:rPr>
-              <w:sym w:font="DejaVu Sans" w:char="F0A8"/>
+              <w:t>☐</w:t>
             </w:r>
           </w:p>
         </w:tc>
@@ -1274,9 +1350,13 @@
                 <w:sz w:val="28"/>
                 <w:szCs w:val="28"/>
                 <w:rFonts w:ascii="DejaVu Sans" w:hAnsi="DejaVu Sans" w:eastAsia="DejaVu Sans" w:cs="DejaVu Sans"/>
+                <w:b w:val="0"/>
+                <w:bCs w:val="0"/>
+                <w:i w:val="0"/>
+                <w:iCs w:val="0"/>
                 <w:rtl w:val="0"/>
               </w:rPr>
-              <w:sym w:font="DejaVu Sans" w:char="F0A8"/>
+              <w:t>☐</w:t>
             </w:r>
           </w:p>
         </w:tc>
@@ -1367,9 +1447,13 @@
                 <w:sz w:val="28"/>
                 <w:szCs w:val="28"/>
                 <w:rFonts w:ascii="DejaVu Sans" w:hAnsi="DejaVu Sans" w:eastAsia="DejaVu Sans" w:cs="DejaVu Sans"/>
+                <w:b w:val="0"/>
+                <w:bCs w:val="0"/>
+                <w:i w:val="0"/>
+                <w:iCs w:val="0"/>
                 <w:rtl w:val="0"/>
               </w:rPr>
-              <w:sym w:font="DejaVu Sans" w:char="F0A8"/>
+              <w:t>☐</w:t>
             </w:r>
           </w:p>
         </w:tc>
@@ -1389,9 +1473,13 @@
                 <w:sz w:val="28"/>
                 <w:szCs w:val="28"/>
                 <w:rFonts w:ascii="DejaVu Sans" w:hAnsi="DejaVu Sans" w:eastAsia="DejaVu Sans" w:cs="DejaVu Sans"/>
+                <w:b w:val="0"/>
+                <w:bCs w:val="0"/>
+                <w:i w:val="0"/>
+                <w:iCs w:val="0"/>
                 <w:rtl w:val="0"/>
               </w:rPr>
-              <w:sym w:font="DejaVu Sans" w:char="F0A8"/>
+              <w:t>☐</w:t>
             </w:r>
           </w:p>
         </w:tc>
@@ -1411,9 +1499,13 @@
                 <w:sz w:val="28"/>
                 <w:szCs w:val="28"/>
                 <w:rFonts w:ascii="DejaVu Sans" w:hAnsi="DejaVu Sans" w:eastAsia="DejaVu Sans" w:cs="DejaVu Sans"/>
+                <w:b w:val="0"/>
+                <w:bCs w:val="0"/>
+                <w:i w:val="0"/>
+                <w:iCs w:val="0"/>
                 <w:rtl w:val="0"/>
               </w:rPr>
-              <w:sym w:font="DejaVu Sans" w:char="F0A8"/>
+              <w:t>☐</w:t>
             </w:r>
           </w:p>
         </w:tc>
@@ -1433,9 +1525,13 @@
                 <w:sz w:val="28"/>
                 <w:szCs w:val="28"/>
                 <w:rFonts w:ascii="DejaVu Sans" w:hAnsi="DejaVu Sans" w:eastAsia="DejaVu Sans" w:cs="DejaVu Sans"/>
+                <w:b w:val="0"/>
+                <w:bCs w:val="0"/>
+                <w:i w:val="0"/>
+                <w:iCs w:val="0"/>
                 <w:rtl w:val="0"/>
               </w:rPr>
-              <w:sym w:font="DejaVu Sans" w:char="F0A8"/>
+              <w:t>☐</w:t>
             </w:r>
           </w:p>
         </w:tc>
@@ -2375,9 +2471,13 @@
           <w:sz w:val="24"/>
           <w:szCs w:val="24"/>
           <w:rFonts w:ascii="DejaVu Sans" w:hAnsi="DejaVu Sans" w:eastAsia="DejaVu Sans" w:cs="DejaVu Sans"/>
-          <w:rtl w:val="0"/>
-        </w:rPr>
-        <w:sym w:font="DejaVu Sans" w:char="F0A8"/>
+          <w:b w:val="0"/>
+          <w:bCs w:val="0"/>
+          <w:i w:val="0"/>
+          <w:iCs w:val="0"/>
+          <w:rtl w:val="0"/>
+        </w:rPr>
+        <w:t>☐</w:t>
       </w:r>
       <w:r>
         <w:rPr>
@@ -2399,9 +2499,13 @@
           <w:sz w:val="24"/>
           <w:szCs w:val="24"/>
           <w:rFonts w:ascii="DejaVu Sans" w:hAnsi="DejaVu Sans" w:eastAsia="DejaVu Sans" w:cs="DejaVu Sans"/>
-          <w:rtl w:val="0"/>
-        </w:rPr>
-        <w:sym w:font="DejaVu Sans" w:char="F0A8"/>
+          <w:b w:val="0"/>
+          <w:bCs w:val="0"/>
+          <w:i w:val="0"/>
+          <w:iCs w:val="0"/>
+          <w:rtl w:val="0"/>
+        </w:rPr>
+        <w:t>☐</w:t>
       </w:r>
       <w:r>
         <w:rPr>
@@ -2423,9 +2527,13 @@
           <w:sz w:val="24"/>
           <w:szCs w:val="24"/>
           <w:rFonts w:ascii="DejaVu Sans" w:hAnsi="DejaVu Sans" w:eastAsia="DejaVu Sans" w:cs="DejaVu Sans"/>
-          <w:rtl w:val="0"/>
-        </w:rPr>
-        <w:sym w:font="DejaVu Sans" w:char="F0A8"/>
+          <w:b w:val="0"/>
+          <w:bCs w:val="0"/>
+          <w:i w:val="0"/>
+          <w:iCs w:val="0"/>
+          <w:rtl w:val="0"/>
+        </w:rPr>
+        <w:t>☐</w:t>
       </w:r>
       <w:r>
         <w:rPr>
@@ -2447,9 +2555,13 @@
           <w:sz w:val="24"/>
           <w:szCs w:val="24"/>
           <w:rFonts w:ascii="DejaVu Sans" w:hAnsi="DejaVu Sans" w:eastAsia="DejaVu Sans" w:cs="DejaVu Sans"/>
-          <w:rtl w:val="0"/>
-        </w:rPr>
-        <w:sym w:font="DejaVu Sans" w:char="F0A8"/>
+          <w:b w:val="0"/>
+          <w:bCs w:val="0"/>
+          <w:i w:val="0"/>
+          <w:iCs w:val="0"/>
+          <w:rtl w:val="0"/>
+        </w:rPr>
+        <w:t>☐</w:t>
       </w:r>
       <w:r>
         <w:rPr>
@@ -2504,9 +2616,13 @@
           <w:sz w:val="24"/>
           <w:szCs w:val="24"/>
           <w:rFonts w:ascii="DejaVu Sans" w:hAnsi="DejaVu Sans" w:eastAsia="DejaVu Sans" w:cs="DejaVu Sans"/>
-          <w:rtl w:val="0"/>
-        </w:rPr>
-        <w:sym w:font="DejaVu Sans" w:char="F0A8"/>
+          <w:b w:val="0"/>
+          <w:bCs w:val="0"/>
+          <w:i w:val="0"/>
+          <w:iCs w:val="0"/>
+          <w:rtl w:val="0"/>
+        </w:rPr>
+        <w:t>☐</w:t>
       </w:r>
       <w:r>
         <w:rPr>
@@ -2528,9 +2644,13 @@
           <w:sz w:val="24"/>
           <w:szCs w:val="24"/>
           <w:rFonts w:ascii="DejaVu Sans" w:hAnsi="DejaVu Sans" w:eastAsia="DejaVu Sans" w:cs="DejaVu Sans"/>
-          <w:rtl w:val="0"/>
-        </w:rPr>
-        <w:sym w:font="DejaVu Sans" w:char="F0A8"/>
+          <w:b w:val="0"/>
+          <w:bCs w:val="0"/>
+          <w:i w:val="0"/>
+          <w:iCs w:val="0"/>
+          <w:rtl w:val="0"/>
+        </w:rPr>
+        <w:t>☐</w:t>
       </w:r>
       <w:r>
         <w:rPr>
@@ -2552,9 +2672,13 @@
           <w:sz w:val="24"/>
           <w:szCs w:val="24"/>
           <w:rFonts w:ascii="DejaVu Sans" w:hAnsi="DejaVu Sans" w:eastAsia="DejaVu Sans" w:cs="DejaVu Sans"/>
-          <w:rtl w:val="0"/>
-        </w:rPr>
-        <w:sym w:font="DejaVu Sans" w:char="F0A8"/>
+          <w:b w:val="0"/>
+          <w:bCs w:val="0"/>
+          <w:i w:val="0"/>
+          <w:iCs w:val="0"/>
+          <w:rtl w:val="0"/>
+        </w:rPr>
+        <w:t>☐</w:t>
       </w:r>
       <w:r>
         <w:rPr>
@@ -2609,9 +2733,13 @@
           <w:sz w:val="24"/>
           <w:szCs w:val="24"/>
           <w:rFonts w:ascii="DejaVu Sans" w:hAnsi="DejaVu Sans" w:eastAsia="DejaVu Sans" w:cs="DejaVu Sans"/>
-          <w:rtl w:val="0"/>
-        </w:rPr>
-        <w:sym w:font="DejaVu Sans" w:char="F0A8"/>
+          <w:b w:val="0"/>
+          <w:bCs w:val="0"/>
+          <w:i w:val="0"/>
+          <w:iCs w:val="0"/>
+          <w:rtl w:val="0"/>
+        </w:rPr>
+        <w:t>☐</w:t>
       </w:r>
       <w:r>
         <w:rPr>
@@ -2633,9 +2761,13 @@
           <w:sz w:val="24"/>
           <w:szCs w:val="24"/>
           <w:rFonts w:ascii="DejaVu Sans" w:hAnsi="DejaVu Sans" w:eastAsia="DejaVu Sans" w:cs="DejaVu Sans"/>
-          <w:rtl w:val="0"/>
-        </w:rPr>
-        <w:sym w:font="DejaVu Sans" w:char="F0A8"/>
+          <w:b w:val="0"/>
+          <w:bCs w:val="0"/>
+          <w:i w:val="0"/>
+          <w:iCs w:val="0"/>
+          <w:rtl w:val="0"/>
+        </w:rPr>
+        <w:t>☐</w:t>
       </w:r>
       <w:r>
         <w:rPr>
@@ -2657,9 +2789,13 @@
           <w:sz w:val="24"/>
           <w:szCs w:val="24"/>
           <w:rFonts w:ascii="DejaVu Sans" w:hAnsi="DejaVu Sans" w:eastAsia="DejaVu Sans" w:cs="DejaVu Sans"/>
-          <w:rtl w:val="0"/>
-        </w:rPr>
-        <w:sym w:font="DejaVu Sans" w:char="F0A8"/>
+          <w:b w:val="0"/>
+          <w:bCs w:val="0"/>
+          <w:i w:val="0"/>
+          <w:iCs w:val="0"/>
+          <w:rtl w:val="0"/>
+        </w:rPr>
+        <w:t>☐</w:t>
       </w:r>
       <w:r>
         <w:rPr>
@@ -2714,9 +2850,13 @@
           <w:sz w:val="24"/>
           <w:szCs w:val="24"/>
           <w:rFonts w:ascii="DejaVu Sans" w:hAnsi="DejaVu Sans" w:eastAsia="DejaVu Sans" w:cs="DejaVu Sans"/>
-          <w:rtl w:val="0"/>
-        </w:rPr>
-        <w:sym w:font="DejaVu Sans" w:char="F0A8"/>
+          <w:b w:val="0"/>
+          <w:bCs w:val="0"/>
+          <w:i w:val="0"/>
+          <w:iCs w:val="0"/>
+          <w:rtl w:val="0"/>
+        </w:rPr>
+        <w:t>☐</w:t>
       </w:r>
       <w:r>
         <w:rPr>
@@ -2738,9 +2878,13 @@
           <w:sz w:val="24"/>
           <w:szCs w:val="24"/>
           <w:rFonts w:ascii="DejaVu Sans" w:hAnsi="DejaVu Sans" w:eastAsia="DejaVu Sans" w:cs="DejaVu Sans"/>
-          <w:rtl w:val="0"/>
-        </w:rPr>
-        <w:sym w:font="DejaVu Sans" w:char="F0A8"/>
+          <w:b w:val="0"/>
+          <w:bCs w:val="0"/>
+          <w:i w:val="0"/>
+          <w:iCs w:val="0"/>
+          <w:rtl w:val="0"/>
+        </w:rPr>
+        <w:t>☐</w:t>
       </w:r>
       <w:r>
         <w:rPr>
@@ -2762,9 +2906,13 @@
           <w:sz w:val="24"/>
           <w:szCs w:val="24"/>
           <w:rFonts w:ascii="DejaVu Sans" w:hAnsi="DejaVu Sans" w:eastAsia="DejaVu Sans" w:cs="DejaVu Sans"/>
-          <w:rtl w:val="0"/>
-        </w:rPr>
-        <w:sym w:font="DejaVu Sans" w:char="F0A8"/>
+          <w:b w:val="0"/>
+          <w:bCs w:val="0"/>
+          <w:i w:val="0"/>
+          <w:iCs w:val="0"/>
+          <w:rtl w:val="0"/>
+        </w:rPr>
+        <w:t>☐</w:t>
       </w:r>
       <w:r>
         <w:rPr>
@@ -3464,8 +3612,8 @@
         <w:rPr>
           <w:b/>
           <w:bCs/>
-          <w:i/>
-          <w:iCs/>
+          <w:i w:val="0"/>
+          <w:iCs w:val="0"/>
           <w:rFonts w:ascii="DejaVu Sans" w:hAnsi="DejaVu Sans" w:eastAsia="DejaVu Sans" w:cs="DejaVu Sans"/>
           <w:rtl w:val="1"/>
         </w:rPr>
@@ -3507,8 +3655,8 @@
     </w:pPr>
     <w:r>
       <w:rPr>
-        <w:i/>
-        <w:iCs/>
+        <w:i w:val="0"/>
+        <w:iCs w:val="0"/>
         <w:sz w:val="16"/>
         <w:szCs w:val="16"/>
         <w:rFonts w:ascii="DejaVu Sans" w:hAnsi="DejaVu Sans" w:eastAsia="DejaVu Sans" w:cs="DejaVu Sans"/>

</xml_diff>